<commit_message>
docs(Compilers/RGR1): add second author's patronymic to the title page
</commit_message>
<xml_diff>
--- a/Year-3/Semester-1/Compilers/RGR/RGR1/Специфікація мови Krok — Степаненко Н.Ю., ТВ-43 (етап 1).docx
+++ b/Year-3/Semester-1/Compilers/RGR/RGR1/Специфікація мови Krok — Степаненко Н.Ю., ТВ-43 (етап 1).docx
@@ -374,7 +374,12 @@
           <w:szCs w:val="28"/>
         </w:rPr>
         <w:tab/>
-        <w:t>Аніщенко Артем</w:t>
+      </w:r>
+      <w:r>
+        <w:rPr>
+          <w:szCs w:val="28"/>
+        </w:rPr>
+        <w:t>Аніщенко Артем Олександрович</w:t>
       </w:r>
     </w:p>
     <w:p>
@@ -759,7 +764,7 @@
       <w:r>
         <w:fldChar w:fldCharType="separate"/>
       </w:r>
-      <w:hyperlink w:anchor="_Toc240920264" w:history="1">
+      <w:hyperlink w:anchor="_Toc240920508" w:history="1">
         <w:r>
           <w:rPr>
             <w:rStyle w:val="Hyperlink"/>
@@ -786,7 +791,7 @@
             <w:noProof/>
             <w:webHidden/>
           </w:rPr>
-          <w:instrText xml:space="preserve"> PAGEREF _Toc240920264 \h </w:instrText>
+          <w:instrText xml:space="preserve"> PAGEREF _Toc240920508 \h </w:instrText>
         </w:r>
         <w:r>
           <w:rPr>
@@ -834,7 +839,7 @@
           <w14:ligatures w14:val="standardContextual"/>
         </w:rPr>
       </w:pPr>
-      <w:hyperlink w:anchor="_Toc240920265" w:history="1">
+      <w:hyperlink w:anchor="_Toc240920509" w:history="1">
         <w:r>
           <w:rPr>
             <w:rStyle w:val="Hyperlink"/>
@@ -861,7 +866,7 @@
             <w:noProof/>
             <w:webHidden/>
           </w:rPr>
-          <w:instrText xml:space="preserve"> PAGEREF _Toc240920265 \h </w:instrText>
+          <w:instrText xml:space="preserve"> PAGEREF _Toc240920509 \h </w:instrText>
         </w:r>
         <w:r>
           <w:rPr>
@@ -909,7 +914,7 @@
           <w14:ligatures w14:val="standardContextual"/>
         </w:rPr>
       </w:pPr>
-      <w:hyperlink w:anchor="_Toc240920266" w:history="1">
+      <w:hyperlink w:anchor="_Toc240920510" w:history="1">
         <w:r>
           <w:rPr>
             <w:rStyle w:val="Hyperlink"/>
@@ -936,7 +941,7 @@
             <w:noProof/>
             <w:webHidden/>
           </w:rPr>
-          <w:instrText xml:space="preserve"> PAGEREF _Toc240920266 \h </w:instrText>
+          <w:instrText xml:space="preserve"> PAGEREF _Toc240920510 \h </w:instrText>
         </w:r>
         <w:r>
           <w:rPr>
@@ -984,7 +989,7 @@
           <w14:ligatures w14:val="standardContextual"/>
         </w:rPr>
       </w:pPr>
-      <w:hyperlink w:anchor="_Toc240920267" w:history="1">
+      <w:hyperlink w:anchor="_Toc240920511" w:history="1">
         <w:r>
           <w:rPr>
             <w:rStyle w:val="Hyperlink"/>
@@ -1011,7 +1016,7 @@
             <w:noProof/>
             <w:webHidden/>
           </w:rPr>
-          <w:instrText xml:space="preserve"> PAGEREF _Toc240920267 \h </w:instrText>
+          <w:instrText xml:space="preserve"> PAGEREF _Toc240920511 \h </w:instrText>
         </w:r>
         <w:r>
           <w:rPr>
@@ -1059,7 +1064,7 @@
           <w14:ligatures w14:val="standardContextual"/>
         </w:rPr>
       </w:pPr>
-      <w:hyperlink w:anchor="_Toc240920268" w:history="1">
+      <w:hyperlink w:anchor="_Toc240920512" w:history="1">
         <w:r>
           <w:rPr>
             <w:rStyle w:val="Hyperlink"/>
@@ -1086,7 +1091,7 @@
             <w:noProof/>
             <w:webHidden/>
           </w:rPr>
-          <w:instrText xml:space="preserve"> PAGEREF _Toc240920268 \h </w:instrText>
+          <w:instrText xml:space="preserve"> PAGEREF _Toc240920512 \h </w:instrText>
         </w:r>
         <w:r>
           <w:rPr>
@@ -1134,7 +1139,7 @@
           <w14:ligatures w14:val="standardContextual"/>
         </w:rPr>
       </w:pPr>
-      <w:hyperlink w:anchor="_Toc240920269" w:history="1">
+      <w:hyperlink w:anchor="_Toc240920513" w:history="1">
         <w:r>
           <w:rPr>
             <w:rStyle w:val="Hyperlink"/>
@@ -1161,7 +1166,7 @@
             <w:noProof/>
             <w:webHidden/>
           </w:rPr>
-          <w:instrText xml:space="preserve"> PAGEREF _Toc240920269 \h </w:instrText>
+          <w:instrText xml:space="preserve"> PAGEREF _Toc240920513 \h </w:instrText>
         </w:r>
         <w:r>
           <w:rPr>
@@ -1209,7 +1214,7 @@
           <w14:ligatures w14:val="standardContextual"/>
         </w:rPr>
       </w:pPr>
-      <w:hyperlink w:anchor="_Toc240920270" w:history="1">
+      <w:hyperlink w:anchor="_Toc240920514" w:history="1">
         <w:r>
           <w:rPr>
             <w:rStyle w:val="Hyperlink"/>
@@ -1236,7 +1241,7 @@
             <w:noProof/>
             <w:webHidden/>
           </w:rPr>
-          <w:instrText xml:space="preserve"> PAGEREF _Toc240920270 \h </w:instrText>
+          <w:instrText xml:space="preserve"> PAGEREF _Toc240920514 \h </w:instrText>
         </w:r>
         <w:r>
           <w:rPr>
@@ -1284,7 +1289,7 @@
           <w14:ligatures w14:val="standardContextual"/>
         </w:rPr>
       </w:pPr>
-      <w:hyperlink w:anchor="_Toc240920271" w:history="1">
+      <w:hyperlink w:anchor="_Toc240920515" w:history="1">
         <w:r>
           <w:rPr>
             <w:rStyle w:val="Hyperlink"/>
@@ -1311,7 +1316,7 @@
             <w:noProof/>
             <w:webHidden/>
           </w:rPr>
-          <w:instrText xml:space="preserve"> PAGEREF _Toc240920271 \h </w:instrText>
+          <w:instrText xml:space="preserve"> PAGEREF _Toc240920515 \h </w:instrText>
         </w:r>
         <w:r>
           <w:rPr>
@@ -1359,7 +1364,7 @@
           <w14:ligatures w14:val="standardContextual"/>
         </w:rPr>
       </w:pPr>
-      <w:hyperlink w:anchor="_Toc240920272" w:history="1">
+      <w:hyperlink w:anchor="_Toc240920516" w:history="1">
         <w:r>
           <w:rPr>
             <w:rStyle w:val="Hyperlink"/>
@@ -1386,7 +1391,7 @@
             <w:noProof/>
             <w:webHidden/>
           </w:rPr>
-          <w:instrText xml:space="preserve"> PAGEREF _Toc240920272 \h </w:instrText>
+          <w:instrText xml:space="preserve"> PAGEREF _Toc240920516 \h </w:instrText>
         </w:r>
         <w:r>
           <w:rPr>
@@ -1434,7 +1439,7 @@
           <w14:ligatures w14:val="standardContextual"/>
         </w:rPr>
       </w:pPr>
-      <w:hyperlink w:anchor="_Toc240920273" w:history="1">
+      <w:hyperlink w:anchor="_Toc240920517" w:history="1">
         <w:r>
           <w:rPr>
             <w:rStyle w:val="Hyperlink"/>
@@ -1461,7 +1466,7 @@
             <w:noProof/>
             <w:webHidden/>
           </w:rPr>
-          <w:instrText xml:space="preserve"> PAGEREF _Toc240920273 \h </w:instrText>
+          <w:instrText xml:space="preserve"> PAGEREF _Toc240920517 \h </w:instrText>
         </w:r>
         <w:r>
           <w:rPr>
@@ -1509,7 +1514,7 @@
           <w14:ligatures w14:val="standardContextual"/>
         </w:rPr>
       </w:pPr>
-      <w:hyperlink w:anchor="_Toc240920274" w:history="1">
+      <w:hyperlink w:anchor="_Toc240920518" w:history="1">
         <w:r>
           <w:rPr>
             <w:rStyle w:val="Hyperlink"/>
@@ -1536,7 +1541,7 @@
             <w:noProof/>
             <w:webHidden/>
           </w:rPr>
-          <w:instrText xml:space="preserve"> PAGEREF _Toc240920274 \h </w:instrText>
+          <w:instrText xml:space="preserve"> PAGEREF _Toc240920518 \h </w:instrText>
         </w:r>
         <w:r>
           <w:rPr>
@@ -1584,7 +1589,7 @@
           <w14:ligatures w14:val="standardContextual"/>
         </w:rPr>
       </w:pPr>
-      <w:hyperlink w:anchor="_Toc240920275" w:history="1">
+      <w:hyperlink w:anchor="_Toc240920519" w:history="1">
         <w:r>
           <w:rPr>
             <w:rStyle w:val="Hyperlink"/>
@@ -1611,7 +1616,7 @@
             <w:noProof/>
             <w:webHidden/>
           </w:rPr>
-          <w:instrText xml:space="preserve"> PAGEREF _Toc240920275 \h </w:instrText>
+          <w:instrText xml:space="preserve"> PAGEREF _Toc240920519 \h </w:instrText>
         </w:r>
         <w:r>
           <w:rPr>
@@ -1659,7 +1664,7 @@
           <w14:ligatures w14:val="standardContextual"/>
         </w:rPr>
       </w:pPr>
-      <w:hyperlink w:anchor="_Toc240920276" w:history="1">
+      <w:hyperlink w:anchor="_Toc240920520" w:history="1">
         <w:r>
           <w:rPr>
             <w:rStyle w:val="Hyperlink"/>
@@ -1686,7 +1691,7 @@
             <w:noProof/>
             <w:webHidden/>
           </w:rPr>
-          <w:instrText xml:space="preserve"> PAGEREF _Toc240920276 \h </w:instrText>
+          <w:instrText xml:space="preserve"> PAGEREF _Toc240920520 \h </w:instrText>
         </w:r>
         <w:r>
           <w:rPr>
@@ -1734,7 +1739,7 @@
           <w14:ligatures w14:val="standardContextual"/>
         </w:rPr>
       </w:pPr>
-      <w:hyperlink w:anchor="_Toc240920277" w:history="1">
+      <w:hyperlink w:anchor="_Toc240920521" w:history="1">
         <w:r>
           <w:rPr>
             <w:rStyle w:val="Hyperlink"/>
@@ -1761,7 +1766,7 @@
             <w:noProof/>
             <w:webHidden/>
           </w:rPr>
-          <w:instrText xml:space="preserve"> PAGEREF _Toc240920277 \h </w:instrText>
+          <w:instrText xml:space="preserve"> PAGEREF _Toc240920521 \h </w:instrText>
         </w:r>
         <w:r>
           <w:rPr>
@@ -1809,7 +1814,7 @@
           <w14:ligatures w14:val="standardContextual"/>
         </w:rPr>
       </w:pPr>
-      <w:hyperlink w:anchor="_Toc240920278" w:history="1">
+      <w:hyperlink w:anchor="_Toc240920522" w:history="1">
         <w:r>
           <w:rPr>
             <w:rStyle w:val="Hyperlink"/>
@@ -1836,7 +1841,7 @@
             <w:noProof/>
             <w:webHidden/>
           </w:rPr>
-          <w:instrText xml:space="preserve"> PAGEREF _Toc240920278 \h </w:instrText>
+          <w:instrText xml:space="preserve"> PAGEREF _Toc240920522 \h </w:instrText>
         </w:r>
         <w:r>
           <w:rPr>
@@ -1884,7 +1889,7 @@
           <w14:ligatures w14:val="standardContextual"/>
         </w:rPr>
       </w:pPr>
-      <w:hyperlink w:anchor="_Toc240920279" w:history="1">
+      <w:hyperlink w:anchor="_Toc240920523" w:history="1">
         <w:r>
           <w:rPr>
             <w:rStyle w:val="Hyperlink"/>
@@ -1911,7 +1916,7 @@
             <w:noProof/>
             <w:webHidden/>
           </w:rPr>
-          <w:instrText xml:space="preserve"> PAGEREF _Toc240920279 \h </w:instrText>
+          <w:instrText xml:space="preserve"> PAGEREF _Toc240920523 \h </w:instrText>
         </w:r>
         <w:r>
           <w:rPr>
@@ -1959,7 +1964,7 @@
           <w14:ligatures w14:val="standardContextual"/>
         </w:rPr>
       </w:pPr>
-      <w:hyperlink w:anchor="_Toc240920280" w:history="1">
+      <w:hyperlink w:anchor="_Toc240920524" w:history="1">
         <w:r>
           <w:rPr>
             <w:rStyle w:val="Hyperlink"/>
@@ -1986,7 +1991,7 @@
             <w:noProof/>
             <w:webHidden/>
           </w:rPr>
-          <w:instrText xml:space="preserve"> PAGEREF _Toc240920280 \h </w:instrText>
+          <w:instrText xml:space="preserve"> PAGEREF _Toc240920524 \h </w:instrText>
         </w:r>
         <w:r>
           <w:rPr>
@@ -2034,7 +2039,7 @@
           <w14:ligatures w14:val="standardContextual"/>
         </w:rPr>
       </w:pPr>
-      <w:hyperlink w:anchor="_Toc240920281" w:history="1">
+      <w:hyperlink w:anchor="_Toc240920525" w:history="1">
         <w:r>
           <w:rPr>
             <w:rStyle w:val="Hyperlink"/>
@@ -2061,7 +2066,7 @@
             <w:noProof/>
             <w:webHidden/>
           </w:rPr>
-          <w:instrText xml:space="preserve"> PAGEREF _Toc240920281 \h </w:instrText>
+          <w:instrText xml:space="preserve"> PAGEREF _Toc240920525 \h </w:instrText>
         </w:r>
         <w:r>
           <w:rPr>
@@ -2109,7 +2114,7 @@
           <w14:ligatures w14:val="standardContextual"/>
         </w:rPr>
       </w:pPr>
-      <w:hyperlink w:anchor="_Toc240920282" w:history="1">
+      <w:hyperlink w:anchor="_Toc240920526" w:history="1">
         <w:r>
           <w:rPr>
             <w:rStyle w:val="Hyperlink"/>
@@ -2136,7 +2141,7 @@
             <w:noProof/>
             <w:webHidden/>
           </w:rPr>
-          <w:instrText xml:space="preserve"> PAGEREF _Toc240920282 \h </w:instrText>
+          <w:instrText xml:space="preserve"> PAGEREF _Toc240920526 \h </w:instrText>
         </w:r>
         <w:r>
           <w:rPr>
@@ -2184,7 +2189,7 @@
           <w14:ligatures w14:val="standardContextual"/>
         </w:rPr>
       </w:pPr>
-      <w:hyperlink w:anchor="_Toc240920283" w:history="1">
+      <w:hyperlink w:anchor="_Toc240920527" w:history="1">
         <w:r>
           <w:rPr>
             <w:rStyle w:val="Hyperlink"/>
@@ -2211,7 +2216,7 @@
             <w:noProof/>
             <w:webHidden/>
           </w:rPr>
-          <w:instrText xml:space="preserve"> PAGEREF _Toc240920283 \h </w:instrText>
+          <w:instrText xml:space="preserve"> PAGEREF _Toc240920527 \h </w:instrText>
         </w:r>
         <w:r>
           <w:rPr>
@@ -2259,7 +2264,7 @@
           <w14:ligatures w14:val="standardContextual"/>
         </w:rPr>
       </w:pPr>
-      <w:hyperlink w:anchor="_Toc240920284" w:history="1">
+      <w:hyperlink w:anchor="_Toc240920528" w:history="1">
         <w:r>
           <w:rPr>
             <w:rStyle w:val="Hyperlink"/>
@@ -2286,7 +2291,7 @@
             <w:noProof/>
             <w:webHidden/>
           </w:rPr>
-          <w:instrText xml:space="preserve"> PAGEREF _Toc240920284 \h </w:instrText>
+          <w:instrText xml:space="preserve"> PAGEREF _Toc240920528 \h </w:instrText>
         </w:r>
         <w:r>
           <w:rPr>
@@ -2334,7 +2339,7 @@
           <w14:ligatures w14:val="standardContextual"/>
         </w:rPr>
       </w:pPr>
-      <w:hyperlink w:anchor="_Toc240920285" w:history="1">
+      <w:hyperlink w:anchor="_Toc240920529" w:history="1">
         <w:r>
           <w:rPr>
             <w:rStyle w:val="Hyperlink"/>
@@ -2361,7 +2366,7 @@
             <w:noProof/>
             <w:webHidden/>
           </w:rPr>
-          <w:instrText xml:space="preserve"> PAGEREF _Toc240920285 \h </w:instrText>
+          <w:instrText xml:space="preserve"> PAGEREF _Toc240920529 \h </w:instrText>
         </w:r>
         <w:r>
           <w:rPr>
@@ -2409,7 +2414,7 @@
           <w14:ligatures w14:val="standardContextual"/>
         </w:rPr>
       </w:pPr>
-      <w:hyperlink w:anchor="_Toc240920286" w:history="1">
+      <w:hyperlink w:anchor="_Toc240920530" w:history="1">
         <w:r>
           <w:rPr>
             <w:rStyle w:val="Hyperlink"/>
@@ -2436,7 +2441,7 @@
             <w:noProof/>
             <w:webHidden/>
           </w:rPr>
-          <w:instrText xml:space="preserve"> PAGEREF _Toc240920286 \h </w:instrText>
+          <w:instrText xml:space="preserve"> PAGEREF _Toc240920530 \h </w:instrText>
         </w:r>
         <w:r>
           <w:rPr>
@@ -2484,7 +2489,7 @@
           <w14:ligatures w14:val="standardContextual"/>
         </w:rPr>
       </w:pPr>
-      <w:hyperlink w:anchor="_Toc240920287" w:history="1">
+      <w:hyperlink w:anchor="_Toc240920531" w:history="1">
         <w:r>
           <w:rPr>
             <w:rStyle w:val="Hyperlink"/>
@@ -2511,7 +2516,7 @@
             <w:noProof/>
             <w:webHidden/>
           </w:rPr>
-          <w:instrText xml:space="preserve"> PAGEREF _Toc240920287 \h </w:instrText>
+          <w:instrText xml:space="preserve"> PAGEREF _Toc240920531 \h </w:instrText>
         </w:r>
         <w:r>
           <w:rPr>
@@ -2559,7 +2564,7 @@
           <w14:ligatures w14:val="standardContextual"/>
         </w:rPr>
       </w:pPr>
-      <w:hyperlink w:anchor="_Toc240920288" w:history="1">
+      <w:hyperlink w:anchor="_Toc240920532" w:history="1">
         <w:r>
           <w:rPr>
             <w:rStyle w:val="Hyperlink"/>
@@ -2586,7 +2591,7 @@
             <w:noProof/>
             <w:webHidden/>
           </w:rPr>
-          <w:instrText xml:space="preserve"> PAGEREF _Toc240920288 \h </w:instrText>
+          <w:instrText xml:space="preserve"> PAGEREF _Toc240920532 \h </w:instrText>
         </w:r>
         <w:r>
           <w:rPr>
@@ -2634,7 +2639,7 @@
           <w14:ligatures w14:val="standardContextual"/>
         </w:rPr>
       </w:pPr>
-      <w:hyperlink w:anchor="_Toc240920289" w:history="1">
+      <w:hyperlink w:anchor="_Toc240920533" w:history="1">
         <w:r>
           <w:rPr>
             <w:rStyle w:val="Hyperlink"/>
@@ -2661,7 +2666,7 @@
             <w:noProof/>
             <w:webHidden/>
           </w:rPr>
-          <w:instrText xml:space="preserve"> PAGEREF _Toc240920289 \h </w:instrText>
+          <w:instrText xml:space="preserve"> PAGEREF _Toc240920533 \h </w:instrText>
         </w:r>
         <w:r>
           <w:rPr>
@@ -2712,7 +2717,7 @@
       <w:pPr>
         <w:pStyle w:val="Heading1"/>
       </w:pPr>
-      <w:bookmarkStart w:id="0" w:name="_Toc240920264"/>
+      <w:bookmarkStart w:id="0" w:name="_Toc240920508"/>
       <w:r>
         <w:t>1 Вступ</w:t>
       </w:r>
@@ -2736,7 +2741,7 @@
       <w:pPr>
         <w:pStyle w:val="Heading2"/>
       </w:pPr>
-      <w:bookmarkStart w:id="1" w:name="_Toc240920265"/>
+      <w:bookmarkStart w:id="1" w:name="_Toc240920509"/>
       <w:r>
         <w:t>1.1 Назва мови</w:t>
       </w:r>
@@ -2784,7 +2789,7 @@
       <w:pPr>
         <w:pStyle w:val="Heading2"/>
       </w:pPr>
-      <w:bookmarkStart w:id="2" w:name="_Toc240920266"/>
+      <w:bookmarkStart w:id="2" w:name="_Toc240920510"/>
       <w:r>
         <w:t>1.2 Рівень складності та мова-прототип</w:t>
       </w:r>
@@ -3842,7 +3847,7 @@
       <w:pPr>
         <w:pStyle w:val="Heading2"/>
       </w:pPr>
-      <w:bookmarkStart w:id="3" w:name="_Toc240920267"/>
+      <w:bookmarkStart w:id="3" w:name="_Toc240920511"/>
       <w:r>
         <w:t>1.3 Призначення та ключові особливості</w:t>
       </w:r>
@@ -3991,7 +3996,7 @@
       <w:pPr>
         <w:pStyle w:val="Heading2"/>
       </w:pPr>
-      <w:bookmarkStart w:id="4" w:name="_Toc240920268"/>
+      <w:bookmarkStart w:id="4" w:name="_Toc240920512"/>
       <w:r>
         <w:t>1.4 Обробка програми</w:t>
       </w:r>
@@ -4075,7 +4080,7 @@
       <w:pPr>
         <w:pStyle w:val="Heading2"/>
       </w:pPr>
-      <w:bookmarkStart w:id="5" w:name="_Toc240920269"/>
+      <w:bookmarkStart w:id="5" w:name="_Toc240920513"/>
       <w:r>
         <w:t>1.5 Нотація</w:t>
       </w:r>
@@ -4085,7 +4090,7 @@
       <w:pPr>
         <w:pStyle w:val="Heading3"/>
       </w:pPr>
-      <w:bookmarkStart w:id="6" w:name="_Toc240920270"/>
+      <w:bookmarkStart w:id="6" w:name="_Toc240920514"/>
       <w:r>
         <w:t>1.5.1 Розширена нотація Бекуса — Наура</w:t>
       </w:r>
@@ -4747,7 +4752,7 @@
       <w:pPr>
         <w:pStyle w:val="Heading3"/>
       </w:pPr>
-      <w:bookmarkStart w:id="7" w:name="_Toc240920271"/>
+      <w:bookmarkStart w:id="7" w:name="_Toc240920515"/>
       <w:r>
         <w:t>1.5.2 Граматика мови у канонічній формі</w:t>
       </w:r>
@@ -4927,7 +4932,7 @@
       <w:pPr>
         <w:pStyle w:val="Heading3"/>
       </w:pPr>
-      <w:bookmarkStart w:id="8" w:name="_Toc240920272"/>
+      <w:bookmarkStart w:id="8" w:name="_Toc240920516"/>
       <w:r>
         <w:t>1.5.3 Синтаксичні діаграми</w:t>
       </w:r>
@@ -5054,7 +5059,7 @@
       <w:pPr>
         <w:pStyle w:val="Heading3"/>
       </w:pPr>
-      <w:bookmarkStart w:id="9" w:name="_Toc240920273"/>
+      <w:bookmarkStart w:id="9" w:name="_Toc240920517"/>
       <w:r>
         <w:t>1.5.4 Представлення семантики</w:t>
       </w:r>
@@ -5092,7 +5097,7 @@
       <w:pPr>
         <w:pStyle w:val="Heading2"/>
       </w:pPr>
-      <w:bookmarkStart w:id="10" w:name="_Toc240920274"/>
+      <w:bookmarkStart w:id="10" w:name="_Toc240920518"/>
       <w:r>
         <w:t>1.6 Відповідність вимогам завдання</w:t>
       </w:r>
@@ -6583,7 +6588,7 @@
       <w:pPr>
         <w:pStyle w:val="Heading1"/>
       </w:pPr>
-      <w:bookmarkStart w:id="11" w:name="_Toc240920275"/>
+      <w:bookmarkStart w:id="11" w:name="_Toc240920519"/>
       <w:r>
         <w:t>2 Лексична структура</w:t>
       </w:r>
@@ -6677,7 +6682,7 @@
       <w:pPr>
         <w:pStyle w:val="Heading2"/>
       </w:pPr>
-      <w:bookmarkStart w:id="12" w:name="_Toc240920276"/>
+      <w:bookmarkStart w:id="12" w:name="_Toc240920520"/>
       <w:r>
         <w:t>2.1 Алфавіт</w:t>
       </w:r>
@@ -6972,7 +6977,7 @@
           <w:noProof/>
         </w:rPr>
         <w:drawing>
-          <wp:inline distT="0" distB="0" distL="0" distR="0" wp14:anchorId="5830D3CE" wp14:editId="643A7494">
+          <wp:inline distT="0" distB="0" distL="0" distR="0" wp14:anchorId="1E577467" wp14:editId="1C195176">
             <wp:extent cx="2253138" cy="2189797"/>
             <wp:effectExtent l="0" t="0" r="0" b="0"/>
             <wp:docPr id="1" name="Picture 1"/>
@@ -7020,7 +7025,7 @@
           <w:noProof/>
         </w:rPr>
         <w:drawing>
-          <wp:inline distT="0" distB="0" distL="0" distR="0" wp14:anchorId="31973D70" wp14:editId="121CCC34">
+          <wp:inline distT="0" distB="0" distL="0" distR="0" wp14:anchorId="1256DEA2" wp14:editId="29A79A43">
             <wp:extent cx="2253138" cy="1375410"/>
             <wp:effectExtent l="0" t="0" r="0" b="0"/>
             <wp:docPr id="2" name="Picture 2"/>
@@ -7068,7 +7073,7 @@
           <w:noProof/>
         </w:rPr>
         <w:drawing>
-          <wp:inline distT="0" distB="0" distL="0" distR="0" wp14:anchorId="75D2AA8C" wp14:editId="2DE5BDE3">
+          <wp:inline distT="0" distB="0" distL="0" distR="0" wp14:anchorId="1DD5B2AA" wp14:editId="2A33F1AF">
             <wp:extent cx="1483995" cy="7619048"/>
             <wp:effectExtent l="0" t="0" r="0" b="0"/>
             <wp:docPr id="3" name="Picture 3"/>
@@ -7116,7 +7121,7 @@
           <w:noProof/>
         </w:rPr>
         <w:drawing>
-          <wp:inline distT="0" distB="0" distL="0" distR="0" wp14:anchorId="61B27F36" wp14:editId="17C71AFA">
+          <wp:inline distT="0" distB="0" distL="0" distR="0" wp14:anchorId="25CB9CD2" wp14:editId="0F4BDA64">
             <wp:extent cx="1483995" cy="7619048"/>
             <wp:effectExtent l="0" t="0" r="0" b="0"/>
             <wp:docPr id="4" name="Picture 4"/>
@@ -7164,7 +7169,7 @@
           <w:noProof/>
         </w:rPr>
         <w:drawing>
-          <wp:inline distT="0" distB="0" distL="0" distR="0" wp14:anchorId="4C62B2ED" wp14:editId="0176FA3B">
+          <wp:inline distT="0" distB="0" distL="0" distR="0" wp14:anchorId="6C05E759" wp14:editId="398923F0">
             <wp:extent cx="2334577" cy="1103947"/>
             <wp:effectExtent l="0" t="0" r="0" b="0"/>
             <wp:docPr id="5" name="Picture 5"/>
@@ -7212,7 +7217,7 @@
           <w:noProof/>
         </w:rPr>
         <w:drawing>
-          <wp:inline distT="0" distB="0" distL="0" distR="0" wp14:anchorId="4C6A4B87" wp14:editId="24E04653">
+          <wp:inline distT="0" distB="0" distL="0" distR="0" wp14:anchorId="5D348986" wp14:editId="438CC3A1">
             <wp:extent cx="1483995" cy="3004185"/>
             <wp:effectExtent l="0" t="0" r="0" b="0"/>
             <wp:docPr id="6" name="Picture 6"/>
@@ -7260,7 +7265,7 @@
           <w:noProof/>
         </w:rPr>
         <w:drawing>
-          <wp:inline distT="0" distB="0" distL="0" distR="0" wp14:anchorId="4AF699A5" wp14:editId="71713152">
+          <wp:inline distT="0" distB="0" distL="0" distR="0" wp14:anchorId="0A39CB30" wp14:editId="66349FCA">
             <wp:extent cx="1483995" cy="6804660"/>
             <wp:effectExtent l="0" t="0" r="0" b="0"/>
             <wp:docPr id="7" name="Picture 7"/>
@@ -7308,7 +7313,7 @@
           <w:noProof/>
         </w:rPr>
         <w:drawing>
-          <wp:inline distT="0" distB="0" distL="0" distR="0" wp14:anchorId="1E7E0396" wp14:editId="635C6170">
+          <wp:inline distT="0" distB="0" distL="0" distR="0" wp14:anchorId="0BE300CC" wp14:editId="1EA2419E">
             <wp:extent cx="4560570" cy="814388"/>
             <wp:effectExtent l="0" t="0" r="0" b="0"/>
             <wp:docPr id="8" name="Picture 8"/>
@@ -7361,7 +7366,7 @@
       <w:pPr>
         <w:pStyle w:val="Heading2"/>
       </w:pPr>
-      <w:bookmarkStart w:id="13" w:name="_Toc240920277"/>
+      <w:bookmarkStart w:id="13" w:name="_Toc240920521"/>
       <w:r>
         <w:t>2.2 Роздільники рядків та пробільні символи</w:t>
       </w:r>
@@ -7442,7 +7447,7 @@
           <w:noProof/>
         </w:rPr>
         <w:drawing>
-          <wp:inline distT="0" distB="0" distL="0" distR="0" wp14:anchorId="6A12FE9F" wp14:editId="75BEFA0B">
+          <wp:inline distT="0" distB="0" distL="0" distR="0" wp14:anchorId="51BC0404" wp14:editId="34F30171">
             <wp:extent cx="1719262" cy="1103947"/>
             <wp:effectExtent l="0" t="0" r="0" b="0"/>
             <wp:docPr id="9" name="Picture 9"/>
@@ -7490,7 +7495,7 @@
           <w:noProof/>
         </w:rPr>
         <w:drawing>
-          <wp:inline distT="0" distB="0" distL="0" distR="0" wp14:anchorId="3A8B617F" wp14:editId="10281563">
+          <wp:inline distT="0" distB="0" distL="0" distR="0" wp14:anchorId="698B2CC8" wp14:editId="1B41E19B">
             <wp:extent cx="2388870" cy="1103948"/>
             <wp:effectExtent l="0" t="0" r="0" b="0"/>
             <wp:docPr id="10" name="Picture 10"/>
@@ -7558,7 +7563,7 @@
       <w:pPr>
         <w:pStyle w:val="Heading2"/>
       </w:pPr>
-      <w:bookmarkStart w:id="14" w:name="_Toc240920278"/>
+      <w:bookmarkStart w:id="14" w:name="_Toc240920522"/>
       <w:r>
         <w:t>2.3 Коментарі</w:t>
       </w:r>
@@ -7639,7 +7644,7 @@
           <w:noProof/>
         </w:rPr>
         <w:drawing>
-          <wp:inline distT="0" distB="0" distL="0" distR="0" wp14:anchorId="6CC93F0B" wp14:editId="7F847F28">
+          <wp:inline distT="0" distB="0" distL="0" distR="0" wp14:anchorId="4978AED5" wp14:editId="35D7EBB5">
             <wp:extent cx="3040380" cy="995362"/>
             <wp:effectExtent l="0" t="0" r="0" b="0"/>
             <wp:docPr id="11" name="Picture 11"/>
@@ -7687,7 +7692,7 @@
           <w:noProof/>
         </w:rPr>
         <w:drawing>
-          <wp:inline distT="0" distB="0" distL="0" distR="0" wp14:anchorId="190F0C9B" wp14:editId="71635F83">
+          <wp:inline distT="0" distB="0" distL="0" distR="0" wp14:anchorId="377A5FC9" wp14:editId="6CB98479">
             <wp:extent cx="4117181" cy="814387"/>
             <wp:effectExtent l="0" t="0" r="0" b="0"/>
             <wp:docPr id="12" name="Picture 12"/>
@@ -7778,7 +7783,7 @@
       <w:pPr>
         <w:pStyle w:val="Heading2"/>
       </w:pPr>
-      <w:bookmarkStart w:id="15" w:name="_Toc240920279"/>
+      <w:bookmarkStart w:id="15" w:name="_Toc240920523"/>
       <w:r>
         <w:t>2.4 Лексеми і токени</w:t>
       </w:r>
@@ -7873,7 +7878,7 @@
           <w:noProof/>
         </w:rPr>
         <w:drawing>
-          <wp:inline distT="0" distB="0" distL="0" distR="0" wp14:anchorId="0C541031" wp14:editId="0FFDD4FC">
+          <wp:inline distT="0" distB="0" distL="0" distR="0" wp14:anchorId="241C09B9" wp14:editId="62ADCA1C">
             <wp:extent cx="2054066" cy="995362"/>
             <wp:effectExtent l="0" t="0" r="0" b="0"/>
             <wp:docPr id="13" name="Picture 13"/>
@@ -7921,7 +7926,7 @@
           <w:noProof/>
         </w:rPr>
         <w:drawing>
-          <wp:inline distT="0" distB="0" distL="0" distR="0" wp14:anchorId="17E08F55" wp14:editId="1CE763CF">
+          <wp:inline distT="0" distB="0" distL="0" distR="0" wp14:anchorId="402F6E16" wp14:editId="769F1AA1">
             <wp:extent cx="2180748" cy="1646872"/>
             <wp:effectExtent l="0" t="0" r="0" b="0"/>
             <wp:docPr id="14" name="Picture 14"/>
@@ -7969,7 +7974,7 @@
           <w:noProof/>
         </w:rPr>
         <w:drawing>
-          <wp:inline distT="0" distB="0" distL="0" distR="0" wp14:anchorId="73ECAAF4" wp14:editId="596739AA">
+          <wp:inline distT="0" distB="0" distL="0" distR="0" wp14:anchorId="50CD8E1F" wp14:editId="78D20A02">
             <wp:extent cx="2099309" cy="2732721"/>
             <wp:effectExtent l="0" t="0" r="0" b="0"/>
             <wp:docPr id="15" name="Picture 15"/>
@@ -8027,7 +8032,7 @@
       <w:pPr>
         <w:pStyle w:val="Heading2"/>
       </w:pPr>
-      <w:bookmarkStart w:id="16" w:name="_Toc240920280"/>
+      <w:bookmarkStart w:id="16" w:name="_Toc240920524"/>
       <w:r>
         <w:t>2.5 Ідентифікатори</w:t>
       </w:r>
@@ -8071,7 +8076,7 @@
           <w:noProof/>
         </w:rPr>
         <w:drawing>
-          <wp:inline distT="0" distB="0" distL="0" distR="0" wp14:anchorId="681C25AB" wp14:editId="1ADDF514">
+          <wp:inline distT="0" distB="0" distL="0" distR="0" wp14:anchorId="2CD6EB42" wp14:editId="4C0C189F">
             <wp:extent cx="3329940" cy="1257776"/>
             <wp:effectExtent l="0" t="0" r="0" b="0"/>
             <wp:docPr id="16" name="Picture 16"/>
@@ -8204,7 +8209,7 @@
       <w:pPr>
         <w:pStyle w:val="Heading2"/>
       </w:pPr>
-      <w:bookmarkStart w:id="17" w:name="_Toc240920281"/>
+      <w:bookmarkStart w:id="17" w:name="_Toc240920525"/>
       <w:r>
         <w:t>2.6 Ключові слова</w:t>
       </w:r>
@@ -8282,7 +8287,7 @@
           <w:noProof/>
         </w:rPr>
         <w:drawing>
-          <wp:inline distT="0" distB="0" distL="0" distR="0" wp14:anchorId="500FBF94" wp14:editId="07357D44">
+          <wp:inline distT="0" distB="0" distL="0" distR="0" wp14:anchorId="071956D8" wp14:editId="72255017">
             <wp:extent cx="1945481" cy="5990272"/>
             <wp:effectExtent l="0" t="0" r="0" b="0"/>
             <wp:docPr id="17" name="Picture 17"/>
@@ -8450,7 +8455,7 @@
       <w:pPr>
         <w:pStyle w:val="Heading2"/>
       </w:pPr>
-      <w:bookmarkStart w:id="18" w:name="_Toc240920282"/>
+      <w:bookmarkStart w:id="18" w:name="_Toc240920526"/>
       <w:r>
         <w:t>2.7 Літерали</w:t>
       </w:r>
@@ -8495,7 +8500,7 @@
       <w:pPr>
         <w:pStyle w:val="Heading3"/>
       </w:pPr>
-      <w:bookmarkStart w:id="19" w:name="_Toc240920283"/>
+      <w:bookmarkStart w:id="19" w:name="_Toc240920527"/>
       <w:r>
         <w:t>2.7.1 Цілі літерали</w:t>
       </w:r>
@@ -8579,7 +8584,7 @@
           <w:noProof/>
         </w:rPr>
         <w:drawing>
-          <wp:inline distT="0" distB="0" distL="0" distR="0" wp14:anchorId="2A134DC8" wp14:editId="419BAE59">
+          <wp:inline distT="0" distB="0" distL="0" distR="0" wp14:anchorId="1C7E8854" wp14:editId="3D40CFAA">
             <wp:extent cx="3529012" cy="1266825"/>
             <wp:effectExtent l="0" t="0" r="0" b="0"/>
             <wp:docPr id="18" name="Picture 18"/>
@@ -8677,7 +8682,7 @@
       <w:pPr>
         <w:pStyle w:val="Heading3"/>
       </w:pPr>
-      <w:bookmarkStart w:id="20" w:name="_Toc240920284"/>
+      <w:bookmarkStart w:id="20" w:name="_Toc240920528"/>
       <w:r>
         <w:t>2.7.2 Дійсні літерали</w:t>
       </w:r>
@@ -8809,7 +8814,7 @@
           <w:noProof/>
         </w:rPr>
         <w:drawing>
-          <wp:inline distT="0" distB="0" distL="0" distR="0" wp14:anchorId="0C7C6B1F" wp14:editId="1C262F20">
+          <wp:inline distT="0" distB="0" distL="0" distR="0" wp14:anchorId="7A6B7BBB" wp14:editId="0876A003">
             <wp:extent cx="4560570" cy="1538288"/>
             <wp:effectExtent l="0" t="0" r="0" b="0"/>
             <wp:docPr id="19" name="Picture 19"/>
@@ -8857,7 +8862,7 @@
           <w:noProof/>
         </w:rPr>
         <w:drawing>
-          <wp:inline distT="0" distB="0" distL="0" distR="0" wp14:anchorId="7FEA8E33" wp14:editId="645E47D7">
+          <wp:inline distT="0" distB="0" distL="0" distR="0" wp14:anchorId="49E535EE" wp14:editId="7952D70E">
             <wp:extent cx="1791652" cy="913923"/>
             <wp:effectExtent l="0" t="0" r="0" b="0"/>
             <wp:docPr id="20" name="Picture 20"/>
@@ -8905,7 +8910,7 @@
           <w:noProof/>
         </w:rPr>
         <w:drawing>
-          <wp:inline distT="0" distB="0" distL="0" distR="0" wp14:anchorId="0FF6F320" wp14:editId="0FD9DB4F">
+          <wp:inline distT="0" distB="0" distL="0" distR="0" wp14:anchorId="7A112DFE" wp14:editId="001E577F">
             <wp:extent cx="3384232" cy="1185386"/>
             <wp:effectExtent l="0" t="0" r="0" b="0"/>
             <wp:docPr id="21" name="Picture 21"/>
@@ -9033,7 +9038,7 @@
       <w:pPr>
         <w:pStyle w:val="Heading3"/>
       </w:pPr>
-      <w:bookmarkStart w:id="21" w:name="_Toc240920285"/>
+      <w:bookmarkStart w:id="21" w:name="_Toc240920529"/>
       <w:r>
         <w:t>2.7.3 Рядкові літерали</w:t>
       </w:r>
@@ -9138,7 +9143,7 @@
           <w:noProof/>
         </w:rPr>
         <w:drawing>
-          <wp:inline distT="0" distB="0" distL="0" distR="0" wp14:anchorId="33BF2085" wp14:editId="464F5858">
+          <wp:inline distT="0" distB="0" distL="0" distR="0" wp14:anchorId="270F5E1B" wp14:editId="139A09C7">
             <wp:extent cx="3239452" cy="995362"/>
             <wp:effectExtent l="0" t="0" r="0" b="0"/>
             <wp:docPr id="22" name="Picture 22"/>
@@ -9186,7 +9191,7 @@
           <w:noProof/>
         </w:rPr>
         <w:drawing>
-          <wp:inline distT="0" distB="0" distL="0" distR="0" wp14:anchorId="6CFD137D" wp14:editId="43E1955A">
+          <wp:inline distT="0" distB="0" distL="0" distR="0" wp14:anchorId="1775E299" wp14:editId="2082D01D">
             <wp:extent cx="2334577" cy="1103947"/>
             <wp:effectExtent l="0" t="0" r="0" b="0"/>
             <wp:docPr id="23" name="Picture 23"/>
@@ -9234,7 +9239,7 @@
           <w:noProof/>
         </w:rPr>
         <w:drawing>
-          <wp:inline distT="0" distB="0" distL="0" distR="0" wp14:anchorId="402B69BF" wp14:editId="5C84AC3C">
+          <wp:inline distT="0" distB="0" distL="0" distR="0" wp14:anchorId="5576BBC8" wp14:editId="470EB9ED">
             <wp:extent cx="2017871" cy="1918335"/>
             <wp:effectExtent l="0" t="0" r="0" b="0"/>
             <wp:docPr id="24" name="Picture 24"/>
@@ -9282,7 +9287,7 @@
           <w:noProof/>
         </w:rPr>
         <w:drawing>
-          <wp:inline distT="0" distB="0" distL="0" distR="0" wp14:anchorId="68D0708E" wp14:editId="1F7AF3F8">
+          <wp:inline distT="0" distB="0" distL="0" distR="0" wp14:anchorId="1AFFA3E0" wp14:editId="5C3E75A1">
             <wp:extent cx="4750593" cy="814387"/>
             <wp:effectExtent l="0" t="0" r="0" b="0"/>
             <wp:docPr id="25" name="Picture 25"/>
@@ -9791,7 +9796,7 @@
       <w:pPr>
         <w:pStyle w:val="Heading3"/>
       </w:pPr>
-      <w:bookmarkStart w:id="22" w:name="_Toc240920286"/>
+      <w:bookmarkStart w:id="22" w:name="_Toc240920530"/>
       <w:r>
         <w:t>2.7.4 Логічні літерали</w:t>
       </w:r>
@@ -9865,7 +9870,7 @@
           <w:noProof/>
         </w:rPr>
         <w:drawing>
-          <wp:inline distT="0" distB="0" distL="0" distR="0" wp14:anchorId="4AEE38A6" wp14:editId="3000240E">
+          <wp:inline distT="0" distB="0" distL="0" distR="0" wp14:anchorId="63339699" wp14:editId="4D25681D">
             <wp:extent cx="1791652" cy="1103947"/>
             <wp:effectExtent l="0" t="0" r="0" b="0"/>
             <wp:docPr id="26" name="Picture 26"/>
@@ -9918,7 +9923,7 @@
       <w:pPr>
         <w:pStyle w:val="Heading2"/>
       </w:pPr>
-      <w:bookmarkStart w:id="23" w:name="_Toc240920287"/>
+      <w:bookmarkStart w:id="23" w:name="_Toc240920531"/>
       <w:r>
         <w:t>2.8 Оператори та роздільники</w:t>
       </w:r>
@@ -10115,7 +10120,7 @@
           <w:noProof/>
         </w:rPr>
         <w:drawing>
-          <wp:inline distT="0" distB="0" distL="0" distR="0" wp14:anchorId="1073E835" wp14:editId="499FF8CB">
+          <wp:inline distT="0" distB="0" distL="0" distR="0" wp14:anchorId="2F17F608" wp14:editId="45464E0C">
             <wp:extent cx="2026919" cy="2189796"/>
             <wp:effectExtent l="0" t="0" r="0" b="0"/>
             <wp:docPr id="27" name="Picture 27"/>
@@ -10163,7 +10168,7 @@
           <w:noProof/>
         </w:rPr>
         <w:drawing>
-          <wp:inline distT="0" distB="0" distL="0" distR="0" wp14:anchorId="19185EC9" wp14:editId="56F91318">
+          <wp:inline distT="0" distB="0" distL="0" distR="0" wp14:anchorId="352D0497" wp14:editId="1B15F3B8">
             <wp:extent cx="1565433" cy="2189796"/>
             <wp:effectExtent l="0" t="0" r="0" b="0"/>
             <wp:docPr id="28" name="Picture 28"/>
@@ -10211,7 +10216,7 @@
           <w:noProof/>
         </w:rPr>
         <w:drawing>
-          <wp:inline distT="0" distB="0" distL="0" distR="0" wp14:anchorId="2C5E63E6" wp14:editId="3C2B42C6">
+          <wp:inline distT="0" distB="0" distL="0" distR="0" wp14:anchorId="34338BAC" wp14:editId="3882174F">
             <wp:extent cx="1565433" cy="1375409"/>
             <wp:effectExtent l="0" t="0" r="0" b="0"/>
             <wp:docPr id="29" name="Picture 29"/>
@@ -10259,7 +10264,7 @@
           <w:noProof/>
         </w:rPr>
         <w:drawing>
-          <wp:inline distT="0" distB="0" distL="0" distR="0" wp14:anchorId="62AD8610" wp14:editId="35FCEF60">
+          <wp:inline distT="0" distB="0" distL="0" distR="0" wp14:anchorId="71C4F2A9" wp14:editId="2B9E29BE">
             <wp:extent cx="1565433" cy="2189796"/>
             <wp:effectExtent l="0" t="0" r="0" b="0"/>
             <wp:docPr id="30" name="Picture 30"/>
@@ -10307,7 +10312,7 @@
           <w:noProof/>
         </w:rPr>
         <w:drawing>
-          <wp:inline distT="0" distB="0" distL="0" distR="0" wp14:anchorId="43780E5E" wp14:editId="6FCBF37A">
+          <wp:inline distT="0" distB="0" distL="0" distR="0" wp14:anchorId="6DB42AAC" wp14:editId="33D601B8">
             <wp:extent cx="1483995" cy="1103948"/>
             <wp:effectExtent l="0" t="0" r="0" b="0"/>
             <wp:docPr id="31" name="Picture 31"/>
@@ -10355,7 +10360,7 @@
           <w:noProof/>
         </w:rPr>
         <w:drawing>
-          <wp:inline distT="0" distB="0" distL="0" distR="0" wp14:anchorId="7E488C86" wp14:editId="4043DE9A">
+          <wp:inline distT="0" distB="0" distL="0" distR="0" wp14:anchorId="340CC5CA" wp14:editId="690C96F8">
             <wp:extent cx="1483995" cy="1375410"/>
             <wp:effectExtent l="0" t="0" r="0" b="0"/>
             <wp:docPr id="32" name="Picture 32"/>
@@ -10403,7 +10408,7 @@
           <w:noProof/>
         </w:rPr>
         <w:drawing>
-          <wp:inline distT="0" distB="0" distL="0" distR="0" wp14:anchorId="06BF7F68" wp14:editId="7B877ADD">
+          <wp:inline distT="0" distB="0" distL="0" distR="0" wp14:anchorId="230897F7" wp14:editId="1BBA997A">
             <wp:extent cx="1483995" cy="1375410"/>
             <wp:effectExtent l="0" t="0" r="0" b="0"/>
             <wp:docPr id="33" name="Picture 33"/>
@@ -10451,7 +10456,7 @@
           <w:noProof/>
         </w:rPr>
         <w:drawing>
-          <wp:inline distT="0" distB="0" distL="0" distR="0" wp14:anchorId="1781786F" wp14:editId="5CF5EF72">
+          <wp:inline distT="0" distB="0" distL="0" distR="0" wp14:anchorId="609EA061" wp14:editId="407B98E2">
             <wp:extent cx="1565433" cy="1103947"/>
             <wp:effectExtent l="0" t="0" r="0" b="0"/>
             <wp:docPr id="34" name="Picture 34"/>
@@ -10499,7 +10504,7 @@
           <w:noProof/>
         </w:rPr>
         <w:drawing>
-          <wp:inline distT="0" distB="0" distL="0" distR="0" wp14:anchorId="61EFE04C" wp14:editId="4A7CB56D">
+          <wp:inline distT="0" distB="0" distL="0" distR="0" wp14:anchorId="60A4E24D" wp14:editId="308A99C3">
             <wp:extent cx="1565433" cy="1103947"/>
             <wp:effectExtent l="0" t="0" r="0" b="0"/>
             <wp:docPr id="35" name="Picture 35"/>
@@ -10547,7 +10552,7 @@
           <w:noProof/>
         </w:rPr>
         <w:drawing>
-          <wp:inline distT="0" distB="0" distL="0" distR="0" wp14:anchorId="2D48ED11" wp14:editId="61BB702D">
+          <wp:inline distT="0" distB="0" distL="0" distR="0" wp14:anchorId="503995FF" wp14:editId="4C3C2E67">
             <wp:extent cx="1483995" cy="3004185"/>
             <wp:effectExtent l="0" t="0" r="0" b="0"/>
             <wp:docPr id="36" name="Picture 36"/>
@@ -10715,7 +10720,7 @@
       <w:pPr>
         <w:pStyle w:val="Heading2"/>
       </w:pPr>
-      <w:bookmarkStart w:id="24" w:name="_Toc240920288"/>
+      <w:bookmarkStart w:id="24" w:name="_Toc240920532"/>
       <w:r>
         <w:t>2.9 Автоматична вставка крапки з комою</w:t>
       </w:r>
@@ -11183,7 +11188,7 @@
       <w:pPr>
         <w:pStyle w:val="Heading2"/>
       </w:pPr>
-      <w:bookmarkStart w:id="25" w:name="_Toc240920289"/>
+      <w:bookmarkStart w:id="25" w:name="_Toc240920533"/>
       <w:r>
         <w:t>2.10 Таблиця токенів</w:t>
       </w:r>
@@ -17368,31 +17373,31 @@
       </w:rPr>
     </w:lvl>
   </w:abstractNum>
-  <w:num w:numId="1" w16cid:durableId="1798256477">
+  <w:num w:numId="1" w16cid:durableId="2100905892">
     <w:abstractNumId w:val="8"/>
   </w:num>
-  <w:num w:numId="2" w16cid:durableId="463935802">
+  <w:num w:numId="2" w16cid:durableId="1136145112">
     <w:abstractNumId w:val="6"/>
   </w:num>
-  <w:num w:numId="3" w16cid:durableId="1730838249">
+  <w:num w:numId="3" w16cid:durableId="1724138966">
     <w:abstractNumId w:val="5"/>
   </w:num>
-  <w:num w:numId="4" w16cid:durableId="360673056">
+  <w:num w:numId="4" w16cid:durableId="1150487681">
     <w:abstractNumId w:val="4"/>
   </w:num>
-  <w:num w:numId="5" w16cid:durableId="752044578">
+  <w:num w:numId="5" w16cid:durableId="1560676667">
     <w:abstractNumId w:val="7"/>
   </w:num>
-  <w:num w:numId="6" w16cid:durableId="2134862933">
+  <w:num w:numId="6" w16cid:durableId="217133480">
     <w:abstractNumId w:val="3"/>
   </w:num>
-  <w:num w:numId="7" w16cid:durableId="1417750455">
+  <w:num w:numId="7" w16cid:durableId="82142355">
     <w:abstractNumId w:val="2"/>
   </w:num>
-  <w:num w:numId="8" w16cid:durableId="2071347556">
+  <w:num w:numId="8" w16cid:durableId="1485321401">
     <w:abstractNumId w:val="1"/>
   </w:num>
-  <w:num w:numId="9" w16cid:durableId="1805386559">
+  <w:num w:numId="9" w16cid:durableId="1975989475">
     <w:abstractNumId w:val="0"/>
   </w:num>
 </w:numbering>
@@ -28794,7 +28799,7 @@
     <w:autoRedefine/>
     <w:uiPriority w:val="39"/>
     <w:unhideWhenUsed/>
-    <w:rsid w:val="007D709D"/>
+    <w:rsid w:val="000E43B2"/>
     <w:pPr>
       <w:spacing w:after="100"/>
     </w:pPr>
@@ -28806,7 +28811,7 @@
     <w:autoRedefine/>
     <w:uiPriority w:val="39"/>
     <w:unhideWhenUsed/>
-    <w:rsid w:val="007D709D"/>
+    <w:rsid w:val="000E43B2"/>
     <w:pPr>
       <w:spacing w:after="100"/>
       <w:ind w:left="280"/>
@@ -28819,7 +28824,7 @@
     <w:autoRedefine/>
     <w:uiPriority w:val="39"/>
     <w:unhideWhenUsed/>
-    <w:rsid w:val="007D709D"/>
+    <w:rsid w:val="000E43B2"/>
     <w:pPr>
       <w:spacing w:after="100"/>
       <w:ind w:left="560"/>
@@ -28830,7 +28835,7 @@
     <w:basedOn w:val="DefaultParagraphFont"/>
     <w:uiPriority w:val="99"/>
     <w:unhideWhenUsed/>
-    <w:rsid w:val="007D709D"/>
+    <w:rsid w:val="000E43B2"/>
     <w:rPr>
       <w:color w:val="0000FF" w:themeColor="hyperlink"/>
       <w:u w:val="single"/>

</xml_diff>